<commit_message>
Refine multivariate forecasting workflow
</commit_message>
<xml_diff>
--- a/examples/multivariate/doc/01-build-ts-data-mv.docx
+++ b/examples/multivariate/doc/01-build-ts-data-mv.docx
@@ -272,7 +272,7 @@
         </w:numPr>
       </w:pPr>
       <w:r>
-        <w:t xml:space="preserve">the holiday indicator from</w:t>
+        <w:t xml:space="preserve">the weekday code from</w:t>
       </w:r>
       <w:r>
         <w:t xml:space="preserve"> </w:t>
@@ -308,7 +308,7 @@
         </w:numPr>
       </w:pPr>
       <w:r>
-        <w:t xml:space="preserve">the weekday code from</w:t>
+        <w:t xml:space="preserve">a weekend indicator derived from</w:t>
       </w:r>
       <w:r>
         <w:t xml:space="preserve"> </w:t>
@@ -798,7 +798,7 @@
         <w:rPr>
           <w:rStyle w:val="NormalTok"/>
         </w:rPr>
-        <w:t xml:space="preserve">Holiday)</w:t>
+        <w:t xml:space="preserve">Weekday)</w:t>
       </w:r>
       <w:r>
         <w:br/>
@@ -843,7 +843,55 @@
         <w:rPr>
           <w:rStyle w:val="NormalTok"/>
         </w:rPr>
-        <w:t xml:space="preserve">Weekday)</w:t>
+        <w:t xml:space="preserve">Weekday </w:t>
+      </w:r>
+      <w:r>
+        <w:rPr>
+          <w:rStyle w:val="SpecialCharTok"/>
+        </w:rPr>
+        <w:t xml:space="preserve">%in%</w:t>
+      </w:r>
+      <w:r>
+        <w:rPr>
+          <w:rStyle w:val="NormalTok"/>
+        </w:rPr>
+        <w:t xml:space="preserve"> </w:t>
+      </w:r>
+      <w:r>
+        <w:rPr>
+          <w:rStyle w:val="FunctionTok"/>
+        </w:rPr>
+        <w:t xml:space="preserve">c</w:t>
+      </w:r>
+      <w:r>
+        <w:rPr>
+          <w:rStyle w:val="NormalTok"/>
+        </w:rPr>
+        <w:t xml:space="preserve">(</w:t>
+      </w:r>
+      <w:r>
+        <w:rPr>
+          <w:rStyle w:val="DecValTok"/>
+        </w:rPr>
+        <w:t xml:space="preserve">1</w:t>
+      </w:r>
+      <w:r>
+        <w:rPr>
+          <w:rStyle w:val="NormalTok"/>
+        </w:rPr>
+        <w:t xml:space="preserve">, </w:t>
+      </w:r>
+      <w:r>
+        <w:rPr>
+          <w:rStyle w:val="DecValTok"/>
+        </w:rPr>
+        <w:t xml:space="preserve">7</w:t>
+      </w:r>
+      <w:r>
+        <w:rPr>
+          <w:rStyle w:val="NormalTok"/>
+        </w:rPr>
+        <w:t xml:space="preserve">))</w:t>
       </w:r>
     </w:p>
     <w:p>
@@ -1107,43 +1155,43 @@
         <w:rPr>
           <w:rStyle w:val="VerbatimChar"/>
         </w:rPr>
-        <w:t xml:space="preserve">## 1 797  1  4</w:t>
-      </w:r>
-      <w:r>
-        <w:br/>
-      </w:r>
-      <w:r>
-        <w:rPr>
-          <w:rStyle w:val="VerbatimChar"/>
-        </w:rPr>
-        <w:t xml:space="preserve">## 2 777  0  5</w:t>
-      </w:r>
-      <w:r>
-        <w:br/>
-      </w:r>
-      <w:r>
-        <w:rPr>
-          <w:rStyle w:val="VerbatimChar"/>
-        </w:rPr>
-        <w:t xml:space="preserve">## 3 797  0  6</w:t>
-      </w:r>
-      <w:r>
-        <w:br/>
-      </w:r>
-      <w:r>
-        <w:rPr>
-          <w:rStyle w:val="VerbatimChar"/>
-        </w:rPr>
-        <w:t xml:space="preserve">## 4 757  0  7</w:t>
-      </w:r>
-      <w:r>
-        <w:br/>
-      </w:r>
-      <w:r>
-        <w:rPr>
-          <w:rStyle w:val="VerbatimChar"/>
-        </w:rPr>
-        <w:t xml:space="preserve">## 5 707  0  1</w:t>
+        <w:t xml:space="preserve">## 1 797  4  0</w:t>
+      </w:r>
+      <w:r>
+        <w:br/>
+      </w:r>
+      <w:r>
+        <w:rPr>
+          <w:rStyle w:val="VerbatimChar"/>
+        </w:rPr>
+        <w:t xml:space="preserve">## 2 777  5  0</w:t>
+      </w:r>
+      <w:r>
+        <w:br/>
+      </w:r>
+      <w:r>
+        <w:rPr>
+          <w:rStyle w:val="VerbatimChar"/>
+        </w:rPr>
+        <w:t xml:space="preserve">## 3 797  6  0</w:t>
+      </w:r>
+      <w:r>
+        <w:br/>
+      </w:r>
+      <w:r>
+        <w:rPr>
+          <w:rStyle w:val="VerbatimChar"/>
+        </w:rPr>
+        <w:t xml:space="preserve">## 4 757  7  1</w:t>
+      </w:r>
+      <w:r>
+        <w:br/>
+      </w:r>
+      <w:r>
+        <w:rPr>
+          <w:rStyle w:val="VerbatimChar"/>
+        </w:rPr>
+        <w:t xml:space="preserve">## 5 707  1  1</w:t>
       </w:r>
     </w:p>
     <w:p>
@@ -1484,25 +1532,25 @@
         <w:rPr>
           <w:rStyle w:val="VerbatimChar"/>
         </w:rPr>
-        <w:t xml:space="preserve">## 1 797  1  4</w:t>
-      </w:r>
-      <w:r>
-        <w:br/>
-      </w:r>
-      <w:r>
-        <w:rPr>
-          <w:rStyle w:val="VerbatimChar"/>
-        </w:rPr>
-        <w:t xml:space="preserve">## 2 777  0  5</w:t>
-      </w:r>
-      <w:r>
-        <w:br/>
-      </w:r>
-      <w:r>
-        <w:rPr>
-          <w:rStyle w:val="VerbatimChar"/>
-        </w:rPr>
-        <w:t xml:space="preserve">## 3 797  0  6</w:t>
+        <w:t xml:space="preserve">## 1 797  4  0</w:t>
+      </w:r>
+      <w:r>
+        <w:br/>
+      </w:r>
+      <w:r>
+        <w:rPr>
+          <w:rStyle w:val="VerbatimChar"/>
+        </w:rPr>
+        <w:t xml:space="preserve">## 2 777  5  0</w:t>
+      </w:r>
+      <w:r>
+        <w:br/>
+      </w:r>
+      <w:r>
+        <w:rPr>
+          <w:rStyle w:val="VerbatimChar"/>
+        </w:rPr>
+        <w:t xml:space="preserve">## 3 797  6  0</w:t>
       </w:r>
     </w:p>
     <w:p>
@@ -1563,25 +1611,25 @@
         <w:rPr>
           <w:rStyle w:val="VerbatimChar"/>
         </w:rPr>
-        <w:t xml:space="preserve">## 757 791  0  4</w:t>
-      </w:r>
-      <w:r>
-        <w:br/>
-      </w:r>
-      <w:r>
-        <w:rPr>
-          <w:rStyle w:val="VerbatimChar"/>
-        </w:rPr>
-        <w:t xml:space="preserve">## 758 776  0  5</w:t>
-      </w:r>
-      <w:r>
-        <w:br/>
-      </w:r>
-      <w:r>
-        <w:rPr>
-          <w:rStyle w:val="VerbatimChar"/>
-        </w:rPr>
-        <w:t xml:space="preserve">## 759 792  0  6</w:t>
+        <w:t xml:space="preserve">## 757 791  4  0</w:t>
+      </w:r>
+      <w:r>
+        <w:br/>
+      </w:r>
+      <w:r>
+        <w:rPr>
+          <w:rStyle w:val="VerbatimChar"/>
+        </w:rPr>
+        <w:t xml:space="preserve">## 758 776  5  0</w:t>
+      </w:r>
+      <w:r>
+        <w:br/>
+      </w:r>
+      <w:r>
+        <w:rPr>
+          <w:rStyle w:val="VerbatimChar"/>
+        </w:rPr>
+        <w:t xml:space="preserve">## 759 792  6  0</w:t>
       </w:r>
     </w:p>
     <w:p>

</xml_diff>